<commit_message>
Publish exact sensor data subset and link paper code availability
</commit_message>
<xml_diff>
--- a/manuscript/manuscript_v10_zh.docx
+++ b/manuscript/manuscript_v10_zh.docx
@@ -21,8 +21,6 @@
         </w:rPr>
         <w:t>信息</w:t>
       </w:r>
-      <w:bookmarkStart w:id="56" w:name="_GoBack"/>
-      <w:bookmarkEnd w:id="56"/>
       <w:r>
         <w:rPr>
           <w:sz w:val="34"/>
@@ -61,9 +59,30 @@
         <w:ind w:firstLine="440" w:firstLineChars="200"/>
         <w:jc w:val="both"/>
         <w:textAlignment w:val="auto"/>
+        <w:rPr>
+          <w:rFonts w:hint="default" w:eastAsia="宋体"/>
+          <w:lang w:val="en-US" w:eastAsia="zh-CN"/>
+        </w:rPr>
       </w:pPr>
       <w:r>
-        <w:t>奶牛行为的准确识别是健康监测、动物福利评估和精准饲养管理的重要基础。多源传感器为自动化行为监测提供了位置、姿态和活动状态信息，但观测更新频率不同，单一时刻的输入难以充分反映行为变化。为此，本文构建一种融合多源短时历史与当前状态的奶牛行为识别方法。将超宽带位置、头部方向和踝部派生躺卧状态对齐为60秒历史窗口，通过有效性、更新标记和来源年龄描述观测状态；采用三分支门控循环单元（GRU）提取历史特征，并与当前状态融合完成分类。基于MmCows单日十头奶牛数据开展七类行为识别评价。在时间划分（TS）下，相比以位置、头部方向和踝部躺卧状态的当前观测为输入的随机森林基线，本文方法将宏F1由73.71%提高至81.30%，提升7.60个百分点；在个体划分（OS）下，宏F1达到78.16%。在网络规模与验证选型规则一致的条件下，相比将当前观测重复输入的GRU对照，历史输入使TS和OS宏F1分别提高5.50和3.39个百分点；窗口统计随机森林对照也获得历史信息增益。组件消融表明，位置流与头部方向是主要判别输入。研究结果表明，短时历史能够补充当前观测中的行为判别信息，为多源传感器的输入组织与融合识别提供了依据。</w:t>
+        <w:t>奶牛行为的准确识别是健康监测、动物福利评估和精准饲养管理的重要基础。多源传感器为自动化监测提供了位置、姿态和活动状态信息，但观测更新频率不同，单一时刻输入难以充分反映行为变化。为此，本文提出一种融合多源短时历史与当前状态的奶牛行为识别方法。将超宽带位置、头部方向和踝部派生躺卧状态按过去来源对齐，构建60秒历史窗口，并通过有效性、更新标记和来源年龄描述观测的可用状态与更新时效。采用三分支门控循环单元（GRU）分别编码各源历史，提取行为变化特征，并通过当前状态直连支路补充目标时刻的观测信息，融合两类表示完成分类。基于MmCows单日十头奶牛数据开展七类行为识别实验。在时间划分（TS）评价下，相比采用三源当前观测的随机森林基线，本文方法的宏F1由73.71%提高至81.30%，提升7.60个百分点；在个体划分（OS）评价下，宏F1达到78.16%。在相同网络规模和验证选型规则下，相比当前信息GRU对照，历史输入使TS和OS宏F1分别提高5.50和3.39个百分点。固定训练配方下的组件消融表明，历史分支承担主要识别增益，位置流与头部方向是主要判别输入。该方法通过融合短时历史变化与当前观测，提高了多源传感器条件下的奶牛行为识别性能。</w:t>
+      </w:r>
+      <w:bookmarkStart w:id="56" w:name="_GoBack"/>
+      <w:bookmarkEnd w:id="56"/>
+      <w:r>
+        <w:t>本文所用数据子集与实验代码公开于</w:t>
+      </w:r>
+      <w:hyperlink r:id="rIdPublicDataset20261019">
+        <w:r>
+          <w:rPr>
+            <w:color w:val="0563C1"/>
+            <w:u w:val="single"/>
+          </w:rPr>
+          <w:t>https://github.com/ziluo8080/Cattle_Behavior_Recognition_Paper</w:t>
+        </w:r>
+      </w:hyperlink>
+      <w:r>
+        <w:t>。</w:t>
       </w:r>
     </w:p>
     <w:p>
@@ -2976,7 +2995,7 @@
       <w:r>
         <w:drawing>
           <wp:inline distT="0" distB="0" distL="0" distR="0">
-            <wp:extent cx="5975985" cy="3756333"/>
+            <wp:extent cx="5975985" cy="3756025"/>
             <wp:effectExtent l="0" t="0" r="0" b="0"/>
             <wp:docPr id="17" name="Picture" descr="图1 中文可读性修订；原生SVG及600 dpi PNG兼容图。" title="图1 中文方法示意图"/>
             <wp:cNvGraphicFramePr>
@@ -2992,10 +3011,10 @@
                     </pic:cNvPicPr>
                   </pic:nvPicPr>
                   <pic:blipFill>
-                    <a:blip r:embed="rId7">
+                    <a:blip r:embed="rId8">
                       <a:extLst>
                         <a:ext uri="{96DAC541-7B7A-43D3-8B79-37D633B846F1}">
-                          <asvg:svgBlip xmlns:asvg="http://schemas.microsoft.com/office/drawing/2016/SVG/main" r:embed="rId8"/>
+                          <asvg:svgBlip xmlns:asvg="http://schemas.microsoft.com/office/drawing/2016/SVG/main" r:embed="rId9"/>
                         </a:ext>
                       </a:extLst>
                     </a:blip>
@@ -3070,10 +3089,10 @@
                     </pic:cNvPicPr>
                   </pic:nvPicPr>
                   <pic:blipFill>
-                    <a:blip r:embed="rId9">
+                    <a:blip r:embed="rId10">
                       <a:extLst>
                         <a:ext uri="{96DAC541-7B7A-43D3-8B79-37D633B846F1}">
-                          <asvg:svgBlip xmlns:asvg="http://schemas.microsoft.com/office/drawing/2016/SVG/main" r:embed="rId10"/>
+                          <asvg:svgBlip xmlns:asvg="http://schemas.microsoft.com/office/drawing/2016/SVG/main" r:embed="rId11"/>
                         </a:ext>
                       </a:extLst>
                     </a:blip>
@@ -4074,10 +4093,10 @@
                     </pic:cNvPicPr>
                   </pic:nvPicPr>
                   <pic:blipFill>
-                    <a:blip r:embed="rId11">
+                    <a:blip r:embed="rId12">
                       <a:extLst>
                         <a:ext uri="{96DAC541-7B7A-43D3-8B79-37D633B846F1}">
-                          <asvg:svgBlip xmlns:asvg="http://schemas.microsoft.com/office/drawing/2016/SVG/main" r:embed="rId12"/>
+                          <asvg:svgBlip xmlns:asvg="http://schemas.microsoft.com/office/drawing/2016/SVG/main" r:embed="rId13"/>
                         </a:ext>
                       </a:extLst>
                     </a:blip>
@@ -4438,7 +4457,7 @@
       <w:r>
         <w:drawing>
           <wp:inline distT="0" distB="0" distL="0" distR="0">
-            <wp:extent cx="5975985" cy="3500220"/>
+            <wp:extent cx="5975985" cy="3500120"/>
             <wp:effectExtent l="0" t="0" r="0" b="0"/>
             <wp:docPr id="23" name="Picture 23" descr="图4 中文可读性修订；原生SVG及600 dpi PNG兼容图。" title="图4 中文方法示意图"/>
             <wp:cNvGraphicFramePr>
@@ -4454,10 +4473,10 @@
                     </pic:cNvPicPr>
                   </pic:nvPicPr>
                   <pic:blipFill>
-                    <a:blip r:embed="rId13">
+                    <a:blip r:embed="rId14">
                       <a:extLst>
                         <a:ext uri="{96DAC541-7B7A-43D3-8B79-37D633B846F1}">
-                          <asvg:svgBlip xmlns:asvg="http://schemas.microsoft.com/office/drawing/2016/SVG/main" r:embed="rId14"/>
+                          <asvg:svgBlip xmlns:asvg="http://schemas.microsoft.com/office/drawing/2016/SVG/main" r:embed="rId15"/>
                         </a:ext>
                       </a:extLst>
                     </a:blip>
@@ -18056,10 +18075,10 @@
                     </pic:cNvPicPr>
                   </pic:nvPicPr>
                   <pic:blipFill>
-                    <a:blip r:embed="rId15">
+                    <a:blip r:embed="rId16">
                       <a:extLst>
                         <a:ext uri="{96DAC541-7B7A-43D3-8B79-37D633B846F1}">
-                          <asvg:svgBlip xmlns:asvg="http://schemas.microsoft.com/office/drawing/2016/SVG/main" r:embed="rId16"/>
+                          <asvg:svgBlip xmlns:asvg="http://schemas.microsoft.com/office/drawing/2016/SVG/main" r:embed="rId17"/>
                         </a:ext>
                       </a:extLst>
                     </a:blip>
@@ -18354,7 +18373,7 @@
         <w:jc w:val="both"/>
       </w:pPr>
       <w:r>
-        <w:t>原始数据与基准代码来自MmCows公开资源[</w:t>
+        <w:t>本研究使用的传感器与行为标签数据来自MmCows公开数据集[</w:t>
       </w:r>
       <w:r>
         <w:fldChar w:fldCharType="begin"/>
@@ -18372,7 +18391,19 @@
         <w:fldChar w:fldCharType="end"/>
       </w:r>
       <w:r>
-        <w:t>]。本文方法实现、配置、目标与划分索引、保存的逐目标预测、结果及图表源数据公开于审稿资料仓库；补充表S1—S7随独立文档提供。</w:t>
+        <w:t>]。本文所用40个原始CSV组成的数据子集、数据预处理与模型训练代码、MmCows随机森林基准源码、实验配置、数据划分索引及预测结果已公开于</w:t>
+      </w:r>
+      <w:hyperlink r:id="rIdPublicDataset20261019">
+        <w:r>
+          <w:rPr>
+            <w:color w:val="0563C1"/>
+            <w:u w:val="single"/>
+          </w:rPr>
+          <w:t>https://github.com/ziluo8080/Cattle_Behavior_Recognition_Paper</w:t>
+        </w:r>
+      </w:hyperlink>
+      <w:r>
+        <w:t>。</w:t>
       </w:r>
     </w:p>
     <w:p>
@@ -18380,26 +18411,7 @@
         <w:jc w:val="both"/>
       </w:pPr>
       <w:r>
-        <w:t>公开的</w:t>
-      </w:r>
-      <w:hyperlink r:id="rIdV10Repository">
-        <w:r>
-          <w:rPr>
-            <w:u w:val="single"/>
-          </w:rPr>
-          <w:t>审稿资料仓库</w:t>
-        </w:r>
-      </w:hyperlink>
-      <w:r>
-        <w:t>采用固定标签paper-v10-20261019。其中的标准库脚本核对主要表格，逐目标预测核查脚本复算均值及条件区间。完整训练所需原始观测通过MmCows官方渠道获取；作者的私人仓库另存完整操作快照，用于恢复环境、模型和缓存。</w:t>
-      </w:r>
-    </w:p>
-    <w:p>
-      <w:pPr>
-        <w:jc w:val="both"/>
-      </w:pPr>
-      <w:r>
-        <w:t>本研究对公开MmCows数据进行二次分析，未开展新的动物试验。原始数据采集、标注与动物研究信息见数据集说明。</w:t>
+        <w:t>对应固定版本为paper-v10-20261019-r2。原始CSV的来源路径、文件校验值及许可信息随仓库提供；补充表S1—S7见补充材料，数据获取与运行步骤见仓库说明。</w:t>
       </w:r>
     </w:p>
     <w:p>
@@ -18408,13 +18420,30 @@
         <w:spacing w:before="220"/>
       </w:pPr>
       <w:r>
+        <w:t>伦理声明</w:t>
+      </w:r>
+    </w:p>
+    <w:p>
+      <w:pPr>
+        <w:jc w:val="both"/>
+      </w:pPr>
+      <w:r>
+        <w:t>本研究对公开MmCows数据进行二次分析，未开展新的动物试验。原始数据采集、标注与动物研究信息见数据集说明。</w:t>
+      </w:r>
+    </w:p>
+    <w:p>
+      <w:pPr>
+        <w:pStyle w:val="3"/>
+        <w:spacing w:before="220"/>
+      </w:pPr>
+      <w:r>
         <w:t>参考文献</w:t>
       </w:r>
     </w:p>
     <w:p>
       <w:pPr>
         <w:keepLines/>
-        <w:spacing w:line="240" w:lineRule="auto" w:after="60" w:before="0"/>
+        <w:spacing w:before="0" w:after="60" w:line="240" w:lineRule="auto"/>
         <w:ind w:left="420" w:hanging="420"/>
       </w:pPr>
       <w:r>
@@ -18486,7 +18515,7 @@
     <w:p>
       <w:pPr>
         <w:keepLines/>
-        <w:spacing w:line="240" w:lineRule="auto" w:after="60" w:before="0"/>
+        <w:spacing w:before="0" w:after="60" w:line="240" w:lineRule="auto"/>
         <w:ind w:left="420" w:hanging="420"/>
       </w:pPr>
       <w:r>
@@ -18558,7 +18587,7 @@
     <w:p>
       <w:pPr>
         <w:keepLines/>
-        <w:spacing w:line="240" w:lineRule="auto" w:after="60" w:before="0"/>
+        <w:spacing w:before="0" w:after="60" w:line="240" w:lineRule="auto"/>
         <w:ind w:left="420" w:hanging="420"/>
       </w:pPr>
       <w:r>
@@ -18630,7 +18659,7 @@
     <w:p>
       <w:pPr>
         <w:keepLines/>
-        <w:spacing w:line="240" w:lineRule="auto" w:after="60" w:before="0"/>
+        <w:spacing w:before="0" w:after="60" w:line="240" w:lineRule="auto"/>
         <w:ind w:left="420" w:hanging="420"/>
       </w:pPr>
       <w:r>
@@ -18702,7 +18731,7 @@
     <w:p>
       <w:pPr>
         <w:keepLines/>
-        <w:spacing w:line="240" w:lineRule="auto" w:after="60" w:before="0"/>
+        <w:spacing w:before="0" w:after="60" w:line="240" w:lineRule="auto"/>
         <w:ind w:left="420" w:hanging="420"/>
       </w:pPr>
       <w:r>
@@ -18774,7 +18803,7 @@
     <w:p>
       <w:pPr>
         <w:keepLines/>
-        <w:spacing w:line="240" w:lineRule="auto" w:after="60" w:before="0"/>
+        <w:spacing w:before="0" w:after="60" w:line="240" w:lineRule="auto"/>
         <w:ind w:left="420" w:hanging="420"/>
       </w:pPr>
       <w:r>
@@ -18846,7 +18875,7 @@
     <w:p>
       <w:pPr>
         <w:keepLines/>
-        <w:spacing w:line="240" w:lineRule="auto" w:after="60" w:before="0"/>
+        <w:spacing w:before="0" w:after="60" w:line="240" w:lineRule="auto"/>
         <w:ind w:left="420" w:hanging="420"/>
       </w:pPr>
       <w:r>
@@ -18918,7 +18947,7 @@
     <w:p>
       <w:pPr>
         <w:keepLines/>
-        <w:spacing w:line="240" w:lineRule="auto" w:after="60" w:before="0"/>
+        <w:spacing w:before="0" w:after="60" w:line="240" w:lineRule="auto"/>
         <w:ind w:left="420" w:hanging="420"/>
       </w:pPr>
       <w:r>
@@ -18990,7 +19019,7 @@
     <w:p>
       <w:pPr>
         <w:keepLines/>
-        <w:spacing w:line="240" w:lineRule="auto" w:after="60" w:before="0"/>
+        <w:spacing w:before="0" w:after="60" w:line="240" w:lineRule="auto"/>
         <w:ind w:left="420" w:hanging="420"/>
       </w:pPr>
       <w:r>
@@ -19062,7 +19091,7 @@
     <w:p>
       <w:pPr>
         <w:keepLines/>
-        <w:spacing w:line="240" w:lineRule="auto" w:after="60" w:before="0"/>
+        <w:spacing w:before="0" w:after="60" w:line="240" w:lineRule="auto"/>
         <w:ind w:left="420" w:hanging="420"/>
       </w:pPr>
       <w:r>
@@ -19134,7 +19163,7 @@
     <w:p>
       <w:pPr>
         <w:keepLines/>
-        <w:spacing w:line="240" w:lineRule="auto" w:after="60" w:before="0"/>
+        <w:spacing w:before="0" w:after="60" w:line="240" w:lineRule="auto"/>
         <w:ind w:left="420" w:hanging="420"/>
       </w:pPr>
       <w:r>
@@ -19206,7 +19235,7 @@
     <w:p>
       <w:pPr>
         <w:keepLines/>
-        <w:spacing w:line="240" w:lineRule="auto" w:after="60" w:before="0"/>
+        <w:spacing w:before="0" w:after="60" w:line="240" w:lineRule="auto"/>
         <w:ind w:left="420" w:hanging="420"/>
       </w:pPr>
       <w:r>
@@ -19278,7 +19307,7 @@
     <w:p>
       <w:pPr>
         <w:keepLines/>
-        <w:spacing w:line="240" w:lineRule="auto" w:after="60" w:before="0"/>
+        <w:spacing w:before="0" w:after="60" w:line="240" w:lineRule="auto"/>
         <w:ind w:left="420" w:hanging="420"/>
       </w:pPr>
       <w:r>
@@ -19350,7 +19379,7 @@
     <w:p>
       <w:pPr>
         <w:keepLines/>
-        <w:spacing w:line="240" w:lineRule="auto" w:after="60" w:before="0"/>
+        <w:spacing w:before="0" w:after="60" w:line="240" w:lineRule="auto"/>
         <w:ind w:left="420" w:hanging="420"/>
       </w:pPr>
       <w:r>
@@ -19422,7 +19451,7 @@
     <w:p>
       <w:pPr>
         <w:keepLines/>
-        <w:spacing w:line="240" w:lineRule="auto" w:after="60" w:before="0"/>
+        <w:spacing w:before="0" w:after="60" w:line="240" w:lineRule="auto"/>
         <w:ind w:left="420" w:hanging="420"/>
       </w:pPr>
       <w:r>
@@ -19494,7 +19523,7 @@
     <w:p>
       <w:pPr>
         <w:keepLines/>
-        <w:spacing w:line="240" w:lineRule="auto" w:after="60" w:before="0"/>
+        <w:spacing w:before="0" w:after="60" w:line="240" w:lineRule="auto"/>
         <w:ind w:left="420" w:hanging="420"/>
       </w:pPr>
       <w:r>
@@ -19566,7 +19595,7 @@
     <w:p>
       <w:pPr>
         <w:keepLines/>
-        <w:spacing w:line="240" w:lineRule="auto" w:after="60" w:before="0"/>
+        <w:spacing w:before="0" w:after="60" w:line="240" w:lineRule="auto"/>
         <w:ind w:left="420" w:hanging="420"/>
       </w:pPr>
       <w:r>
@@ -19638,7 +19667,7 @@
     <w:p>
       <w:pPr>
         <w:keepLines/>
-        <w:spacing w:line="240" w:lineRule="auto" w:after="60" w:before="0"/>
+        <w:spacing w:before="0" w:after="60" w:line="240" w:lineRule="auto"/>
         <w:ind w:left="420" w:hanging="420"/>
       </w:pPr>
       <w:r>
@@ -19710,7 +19739,7 @@
     <w:p>
       <w:pPr>
         <w:keepLines/>
-        <w:spacing w:line="240" w:lineRule="auto" w:after="60" w:before="0"/>
+        <w:spacing w:before="0" w:after="60" w:line="240" w:lineRule="auto"/>
         <w:ind w:left="420" w:hanging="420"/>
       </w:pPr>
       <w:r>
@@ -19782,7 +19811,7 @@
     <w:p>
       <w:pPr>
         <w:keepLines/>
-        <w:spacing w:line="240" w:lineRule="auto" w:after="60" w:before="0"/>
+        <w:spacing w:before="0" w:after="60" w:line="240" w:lineRule="auto"/>
         <w:ind w:left="420" w:hanging="420"/>
       </w:pPr>
       <w:r>
@@ -19854,7 +19883,7 @@
     <w:p>
       <w:pPr>
         <w:keepLines/>
-        <w:spacing w:line="240" w:lineRule="auto" w:after="60" w:before="0"/>
+        <w:spacing w:before="0" w:after="60" w:line="240" w:lineRule="auto"/>
         <w:ind w:left="420" w:hanging="420"/>
       </w:pPr>
       <w:r>
@@ -19926,7 +19955,7 @@
     <w:p>
       <w:pPr>
         <w:keepLines/>
-        <w:spacing w:line="240" w:lineRule="auto" w:after="60" w:before="0"/>
+        <w:spacing w:before="0" w:after="60" w:line="240" w:lineRule="auto"/>
         <w:ind w:left="420" w:hanging="420"/>
       </w:pPr>
       <w:r>
@@ -19998,7 +20027,7 @@
     <w:p>
       <w:pPr>
         <w:keepLines/>
-        <w:spacing w:line="240" w:lineRule="auto" w:after="60" w:before="0"/>
+        <w:spacing w:before="0" w:after="60" w:line="240" w:lineRule="auto"/>
         <w:ind w:left="420" w:hanging="420"/>
       </w:pPr>
       <w:r>
@@ -20070,7 +20099,7 @@
     <w:p>
       <w:pPr>
         <w:keepLines/>
-        <w:spacing w:line="240" w:lineRule="auto" w:after="60" w:before="0"/>
+        <w:spacing w:before="0" w:after="60" w:line="240" w:lineRule="auto"/>
         <w:ind w:left="420" w:hanging="420"/>
       </w:pPr>
       <w:r>
@@ -20142,7 +20171,7 @@
     <w:p>
       <w:pPr>
         <w:keepLines/>
-        <w:spacing w:line="240" w:lineRule="auto" w:after="60" w:before="0"/>
+        <w:spacing w:before="0" w:after="60" w:line="240" w:lineRule="auto"/>
         <w:ind w:left="420" w:hanging="420"/>
       </w:pPr>
       <w:r>
@@ -20214,7 +20243,7 @@
     <w:p>
       <w:pPr>
         <w:keepLines/>
-        <w:spacing w:line="240" w:lineRule="auto" w:after="60" w:before="0"/>
+        <w:spacing w:before="0" w:after="60" w:line="240" w:lineRule="auto"/>
         <w:ind w:left="420" w:hanging="420"/>
       </w:pPr>
       <w:r>
@@ -20286,7 +20315,7 @@
     <w:p>
       <w:pPr>
         <w:keepLines/>
-        <w:spacing w:line="240" w:lineRule="auto" w:after="60" w:before="0"/>
+        <w:spacing w:before="0" w:after="60" w:line="240" w:lineRule="auto"/>
         <w:ind w:left="420" w:hanging="420"/>
       </w:pPr>
       <w:r>
@@ -20358,7 +20387,7 @@
     <w:p>
       <w:pPr>
         <w:keepLines/>
-        <w:spacing w:line="240" w:lineRule="auto" w:after="60" w:before="0"/>
+        <w:spacing w:before="0" w:after="60" w:line="240" w:lineRule="auto"/>
         <w:ind w:left="420" w:hanging="420"/>
       </w:pPr>
       <w:r>
@@ -20430,7 +20459,7 @@
     <w:p>
       <w:pPr>
         <w:keepLines/>
-        <w:spacing w:line="240" w:lineRule="auto" w:after="60" w:before="0"/>
+        <w:spacing w:before="0" w:after="60" w:line="240" w:lineRule="auto"/>
         <w:ind w:left="420" w:hanging="420"/>
       </w:pPr>
       <w:r>
@@ -20502,7 +20531,7 @@
     <w:p>
       <w:pPr>
         <w:keepLines/>
-        <w:spacing w:line="240" w:lineRule="auto" w:after="60" w:before="0"/>
+        <w:spacing w:before="0" w:after="60" w:line="240" w:lineRule="auto"/>
         <w:ind w:left="420" w:hanging="420"/>
       </w:pPr>
       <w:r>
@@ -20574,7 +20603,7 @@
     <w:p>
       <w:pPr>
         <w:keepLines/>
-        <w:spacing w:line="240" w:lineRule="auto" w:after="60" w:before="0"/>
+        <w:spacing w:before="0" w:after="60" w:line="240" w:lineRule="auto"/>
         <w:ind w:left="420" w:hanging="420"/>
       </w:pPr>
       <w:r>
@@ -20646,7 +20675,7 @@
     <w:p>
       <w:pPr>
         <w:keepLines/>
-        <w:spacing w:line="240" w:lineRule="auto" w:after="60" w:before="0"/>
+        <w:spacing w:before="0" w:after="60" w:line="240" w:lineRule="auto"/>
         <w:ind w:left="420" w:hanging="420"/>
       </w:pPr>
       <w:r>
@@ -20718,7 +20747,7 @@
     <w:p>
       <w:pPr>
         <w:keepLines/>
-        <w:spacing w:line="240" w:lineRule="auto" w:after="60" w:before="0"/>
+        <w:spacing w:before="0" w:after="60" w:line="240" w:lineRule="auto"/>
         <w:ind w:left="420" w:hanging="420"/>
       </w:pPr>
       <w:r>
@@ -20790,7 +20819,7 @@
     <w:p>
       <w:pPr>
         <w:keepLines/>
-        <w:spacing w:line="240" w:lineRule="auto" w:after="60" w:before="0"/>
+        <w:spacing w:before="0" w:after="60" w:line="240" w:lineRule="auto"/>
         <w:ind w:left="420" w:hanging="420"/>
       </w:pPr>
       <w:r>
@@ -20862,7 +20891,7 @@
     <w:p>
       <w:pPr>
         <w:keepLines/>
-        <w:spacing w:line="240" w:lineRule="auto" w:after="60" w:before="0"/>
+        <w:spacing w:before="0" w:after="60" w:line="240" w:lineRule="auto"/>
         <w:ind w:left="420" w:hanging="420"/>
       </w:pPr>
       <w:r>
@@ -20934,7 +20963,7 @@
     <w:p>
       <w:pPr>
         <w:keepLines/>
-        <w:spacing w:line="240" w:lineRule="auto" w:after="60" w:before="0"/>
+        <w:spacing w:before="0" w:after="60" w:line="240" w:lineRule="auto"/>
         <w:ind w:left="420" w:hanging="420"/>
       </w:pPr>
       <w:r>
@@ -21006,7 +21035,7 @@
     <w:p>
       <w:pPr>
         <w:keepLines/>
-        <w:spacing w:line="240" w:lineRule="auto" w:after="60" w:before="0"/>
+        <w:spacing w:before="0" w:after="60" w:line="240" w:lineRule="auto"/>
         <w:ind w:left="420" w:hanging="420"/>
       </w:pPr>
       <w:r>
@@ -21078,7 +21107,7 @@
     <w:p>
       <w:pPr>
         <w:keepLines/>
-        <w:spacing w:line="240" w:lineRule="auto" w:after="60" w:before="0"/>
+        <w:spacing w:before="0" w:after="60" w:line="240" w:lineRule="auto"/>
         <w:ind w:left="420" w:hanging="420"/>
       </w:pPr>
       <w:r>
@@ -21150,7 +21179,7 @@
     <w:p>
       <w:pPr>
         <w:keepLines/>
-        <w:spacing w:line="240" w:lineRule="auto" w:after="60" w:before="0"/>
+        <w:spacing w:before="0" w:after="60" w:line="240" w:lineRule="auto"/>
         <w:ind w:left="420" w:hanging="420"/>
       </w:pPr>
       <w:r>
@@ -21222,7 +21251,7 @@
     <w:p>
       <w:pPr>
         <w:keepLines/>
-        <w:spacing w:line="240" w:lineRule="auto" w:after="60" w:before="0"/>
+        <w:spacing w:before="0" w:after="60" w:line="240" w:lineRule="auto"/>
         <w:ind w:left="420" w:hanging="420"/>
       </w:pPr>
       <w:r>
@@ -21294,7 +21323,7 @@
     <w:p>
       <w:pPr>
         <w:keepLines/>
-        <w:spacing w:line="240" w:lineRule="auto" w:after="60" w:before="0"/>
+        <w:spacing w:before="0" w:after="60" w:line="240" w:lineRule="auto"/>
         <w:ind w:left="420" w:hanging="420"/>
       </w:pPr>
       <w:r>
@@ -21366,7 +21395,7 @@
     <w:p>
       <w:pPr>
         <w:keepLines/>
-        <w:spacing w:line="240" w:lineRule="auto" w:after="60" w:before="0"/>
+        <w:spacing w:before="0" w:after="60" w:line="240" w:lineRule="auto"/>
         <w:ind w:left="420" w:hanging="420"/>
       </w:pPr>
       <w:r>
@@ -21438,7 +21467,7 @@
     <w:p>
       <w:pPr>
         <w:keepLines/>
-        <w:spacing w:line="240" w:lineRule="auto" w:after="60" w:before="0"/>
+        <w:spacing w:before="0" w:after="60" w:line="240" w:lineRule="auto"/>
         <w:ind w:left="420" w:hanging="420"/>
       </w:pPr>
       <w:r>
@@ -21510,7 +21539,7 @@
     <w:p>
       <w:pPr>
         <w:keepLines/>
-        <w:spacing w:line="240" w:lineRule="auto" w:after="60" w:before="0"/>
+        <w:spacing w:before="0" w:after="60" w:line="240" w:lineRule="auto"/>
         <w:ind w:left="420" w:hanging="420"/>
       </w:pPr>
       <w:r>
@@ -21582,7 +21611,7 @@
     <w:p>
       <w:pPr>
         <w:keepLines/>
-        <w:spacing w:line="240" w:lineRule="auto" w:after="60" w:before="0"/>
+        <w:spacing w:before="0" w:after="60" w:line="240" w:lineRule="auto"/>
         <w:ind w:left="420" w:hanging="420"/>
       </w:pPr>
       <w:r>
@@ -21654,7 +21683,7 @@
     <w:p>
       <w:pPr>
         <w:keepLines/>
-        <w:spacing w:line="240" w:lineRule="auto" w:after="60" w:before="0"/>
+        <w:spacing w:before="0" w:after="60" w:line="240" w:lineRule="auto"/>
         <w:ind w:left="420" w:hanging="420"/>
       </w:pPr>
       <w:r>
@@ -21726,7 +21755,7 @@
     <w:p>
       <w:pPr>
         <w:keepLines/>
-        <w:spacing w:line="240" w:lineRule="auto" w:after="60" w:before="0"/>
+        <w:spacing w:before="0" w:after="60" w:line="240" w:lineRule="auto"/>
         <w:ind w:left="420" w:hanging="420"/>
       </w:pPr>
       <w:r>
@@ -21798,7 +21827,7 @@
     <w:p>
       <w:pPr>
         <w:keepLines/>
-        <w:spacing w:line="240" w:lineRule="auto" w:after="60" w:before="0"/>
+        <w:spacing w:before="0" w:after="60" w:line="240" w:lineRule="auto"/>
         <w:ind w:left="420" w:hanging="420"/>
       </w:pPr>
       <w:r>
@@ -21868,8 +21897,8 @@
       </w:r>
     </w:p>
     <w:sectPr>
-      <w:footerReference w:type="default" r:id="rIdV10Footer"/>
       <w:headerReference r:id="rId5" w:type="default"/>
+      <w:footerReference r:id="rId6" w:type="default"/>
       <w:pgSz w:w="11906" w:h="16838"/>
       <w:pgMar w:top="1077" w:right="1134" w:bottom="1077" w:left="1134" w:header="454" w:footer="454" w:gutter="0"/>
       <w:cols w:space="720" w:num="1"/>
@@ -21904,20 +21933,33 @@
 </w:endnotes>
 </file>
 
-<file path=word/footer_v10.xml><?xml version="1.0" encoding="utf-8"?>
-<w:ftr xmlns:w="http://schemas.openxmlformats.org/wordprocessingml/2006/main">
+<file path=word/footer1.xml><?xml version="1.0" encoding="utf-8"?>
+<w:ftr xmlns:wpc="http://schemas.microsoft.com/office/word/2010/wordprocessingCanvas" xmlns:mc="http://schemas.openxmlformats.org/markup-compatibility/2006" xmlns:o="urn:schemas-microsoft-com:office:office" xmlns:r="http://schemas.openxmlformats.org/officeDocument/2006/relationships" xmlns:m="http://schemas.openxmlformats.org/officeDocument/2006/math" xmlns:v="urn:schemas-microsoft-com:vml" xmlns:wp14="http://schemas.microsoft.com/office/word/2010/wordprocessingDrawing" xmlns:wp="http://schemas.openxmlformats.org/drawingml/2006/wordprocessingDrawing" xmlns:w10="urn:schemas-microsoft-com:office:word" xmlns:w="http://schemas.openxmlformats.org/wordprocessingml/2006/main" xmlns:w14="http://schemas.microsoft.com/office/word/2010/wordml" xmlns:w15="http://schemas.microsoft.com/office/word/2012/wordml" xmlns:wpg="http://schemas.microsoft.com/office/word/2010/wordprocessingGroup" xmlns:wpi="http://schemas.microsoft.com/office/word/2010/wordprocessingInk" xmlns:wne="http://schemas.microsoft.com/office/word/2006/wordml" xmlns:wps="http://schemas.microsoft.com/office/word/2010/wordprocessingShape" xmlns:wpsCustomData="http://www.wps.cn/officeDocument/2013/wpsCustomData" mc:Ignorable="w14 w15 wp14">
   <w:p>
     <w:pPr>
       <w:jc w:val="center"/>
     </w:pPr>
-    <w:fldSimple w:instr=" PAGE ">
-      <w:r>
-        <w:rPr>
-          <w:sz w:val="20"/>
-        </w:rPr>
-        <w:t>1</w:t>
-      </w:r>
-    </w:fldSimple>
+    <w:r>
+      <w:fldChar w:fldCharType="begin"/>
+    </w:r>
+    <w:r>
+      <w:instrText xml:space="preserve"> PAGE </w:instrText>
+    </w:r>
+    <w:r>
+      <w:fldChar w:fldCharType="separate"/>
+    </w:r>
+    <w:r>
+      <w:rPr>
+        <w:sz w:val="20"/>
+      </w:rPr>
+      <w:t>1</w:t>
+    </w:r>
+    <w:r>
+      <w:rPr>
+        <w:sz w:val="20"/>
+      </w:rPr>
+      <w:fldChar w:fldCharType="end"/>
+    </w:r>
   </w:p>
 </w:ftr>
 </file>
@@ -22103,7 +22145,7 @@
   <w:docDefaults>
     <w:rPrDefault>
       <w:rPr>
-        <w:rFonts w:asciiTheme="minorHAnsi" w:hAnsiTheme="minorHAnsi" w:eastAsiaTheme="minorEastAsia" w:cstheme="minorBidi"/>
+        <w:rFonts w:ascii="Times New Roman" w:hAnsi="Times New Roman" w:eastAsia="宋体" w:cs="Times New Roman"/>
       </w:rPr>
     </w:rPrDefault>
     <w:pPrDefault/>

</xml_diff>